<commit_message>
The pipeline runs as pipelineEditor, and reports who exists
bootstrap.py authenticates as pipelineEditor from the credential the deploy
places on the job, and reads its certificate under the canonical per-identity
names the library uses. The managed identities it previously relied on were
deleted; nothing in the pipeline holds a second identity now.

runbook_bootstrap.py follows the same names.

The entitlement report enumerates principals that exist and hold nothing --
an identity can be created holding no rights and granted them later, and a
report built from rights alone cannot see it in that interval. Its first run
found a dangling reference on the automation account to a deleted identity.

EPIC-002-F-003 is renamed to Manage ChatHealthy.ai 0 Trust implementation.

Co-Authored-By: Claude Opus 5 <noreply@anthropic.com>
</commit_message>
<xml_diff>
--- a/pipeline/ArchitectureDesignAndAudit/ProviderPipeline_LowLevelDesign_v45.docx
+++ b/pipeline/ArchitectureDesignAndAudit/ProviderPipeline_LowLevelDesign_v45.docx
@@ -4912,10 +4912,10 @@
         <w:rPr>
           <w:b/>
         </w:rPr>
-        <w:t>ClaudeCode Azure Entra user identity.</w:t>
-      </w:r>
-      <w:r>
-        <w:t xml:space="preserve"> Provisioned once per environment via the Azure portal with Contributor and User Access Administrator role assignments on the target resource group. The chain cannot create the identity under which the chain itself authenticates.</w:t>
+        <w:t>DevOpsUser Azure Entra application identity.</w:t>
+      </w:r>
+      <w:r>
+        <w:t xml:space="preserve"> Provisioned once per environment via the Azure portal and granted the role assignments the deploy requires on the target resource group. The chain cannot create the identity under which the chain itself authenticates.</w:t>
       </w:r>
     </w:p>
     <w:p>
@@ -4929,7 +4929,7 @@
         <w:t>Azure subscription and resource-group root.</w:t>
       </w:r>
       <w:r>
-        <w:t xml:space="preserve"> Microsoft-billed substrate; the chain cannot provision it. The chain expects a top-level per-env resource group inside the subscription, writeable by the ClaudeCode identity.</w:t>
+        <w:t xml:space="preserve"> Microsoft-billed substrate; the chain cannot provision it. The chain expects a top-level per-env resource group inside the subscription, writeable by the DevOpsUser identity.</w:t>
       </w:r>
     </w:p>
     <w:p>

</xml_diff>